<commit_message>
Chnage of Names to FHTA
</commit_message>
<xml_diff>
--- a/USER_MANUAL.docx
+++ b/USER_MANUAL.docx
@@ -51,7 +51,7 @@
           <w:color w:val="0F2F5F"/>
           <w:sz w:val="52"/>
         </w:rPr>
-        <w:t>FPSPA Website User Manual</w:t>
+        <w:t>FHTA Website User Manual</w:t>
       </w:r>
     </w:p>
     <w:p>
@@ -63,7 +63,7 @@
           <w:color w:val="800000"/>
           <w:sz w:val="30"/>
         </w:rPr>
-        <w:t>Fiji Primary School Principals Association</w:t>
+        <w:t>Fiji Head Teachers Association</w:t>
       </w:r>
     </w:p>
     <w:p>
@@ -87,7 +87,7 @@
         <w:rPr>
           <w:sz w:val="21"/>
         </w:rPr>
-        <w:t>This manual explains how to use the FPSPA website portal, including dashboards, news, events, documents, helpdesk, representatives, training, certificates, and QR attendance.</w:t>
+        <w:t>This manual explains how to use the FHTA website portal, including dashboards, news, events, documents, helpdesk, representatives, training, certificates, and QR attendance.</w:t>
       </w:r>
     </w:p>
     <w:p>
@@ -101,7 +101,7 @@
         <w:jc w:val="center"/>
       </w:pPr>
       <w:r>
-        <w:t>FPSPA Website User Manual</w:t>
+        <w:t>FHTA Website User Manual</w:t>
       </w:r>
     </w:p>
     <w:p>
@@ -111,7 +111,7 @@
     </w:p>
     <w:p>
       <w:r>
-        <w:t>Project: Fiji Primary School Principals Association Website</w:t>
+        <w:t>Project: Fiji Head Teachers Association Website</w:t>
       </w:r>
     </w:p>
     <w:p>
@@ -129,7 +129,7 @@
     </w:p>
     <w:p>
       <w:r>
-        <w:t>The FPSPA website is a member and staff portal for the Fiji Primary School Principals Association. It brings together association news, events, membership profiles, representatives, documents, helpdesk support, and online training/workshops in one system.</w:t>
+        <w:t>The FHTA website is a member and staff portal for the Fiji Head Teachers Association. It brings together association news, events, membership profiles, representatives, documents, helpdesk support, and online training/workshops in one system.</w:t>
       </w:r>
     </w:p>
     <w:p>
@@ -148,7 +148,7 @@
         <w:t>Members</w:t>
       </w:r>
       <w:r>
-        <w:t>: Primary school principals and association members who use the website to access news, events, documents, representatives, helpdesk support, and training.</w:t>
+        <w:t>: Primary school head teachers and association members who use the website to access news, events, documents, representatives, helpdesk support, and training.</w:t>
       </w:r>
     </w:p>
     <w:p>
@@ -162,7 +162,7 @@
         <w:t>Staff/Admin Users</w:t>
       </w:r>
       <w:r>
-        <w:t>: FPSPA staff or administrators who manage content, documents, events, helpdesk tickets, members, courses, workshops, certificates, and QR attendance.</w:t>
+        <w:t>: FHTA staff or administrators who manage content, documents, events, helpdesk tickets, members, courses, workshops, certificates, and QR attendance.</w:t>
       </w:r>
     </w:p>
     <w:p>
@@ -183,7 +183,7 @@
     </w:p>
     <w:p>
       <w:r>
-        <w:t>Open the FPSPA website in your browser. The top navigation gives access to public pages such as:</w:t>
+        <w:t>Open the FHTA website in your browser. The top navigation gives access to public pages such as:</w:t>
       </w:r>
     </w:p>
     <w:p>
@@ -250,7 +250,7 @@
         <w:rPr>
           <w:b/>
         </w:rPr>
-        <w:t>FPSPA Portal sidebar</w:t>
+        <w:t>FHTA Portal sidebar</w:t>
       </w:r>
       <w:r>
         <w:t>, making it easier to move between the main apps.</w:t>
@@ -741,7 +741,7 @@
         <w:pStyle w:val="ListNumber"/>
       </w:pPr>
       <w:r>
-        <w:t>View upcoming FPSPA events.</w:t>
+        <w:t>View upcoming FHTA events.</w:t>
       </w:r>
     </w:p>
     <w:p>
@@ -786,7 +786,7 @@
     </w:p>
     <w:p>
       <w:r>
-        <w:t>The Staff Dashboard is the main operational area for FPSPA staff and administrators.</w:t>
+        <w:t>The Staff Dashboard is the main operational area for FHTA staff and administrators.</w:t>
       </w:r>
     </w:p>
     <w:p>
@@ -1169,7 +1169,7 @@
     </w:p>
     <w:p>
       <w:r>
-        <w:t>If your status is incorrect, contact FPSPA support through the helpdesk.</w:t>
+        <w:t>If your status is incorrect, contact FHTA support through the helpdesk.</w:t>
       </w:r>
     </w:p>
     <w:p>
@@ -1386,7 +1386,7 @@
         <w:pStyle w:val="ListNumber"/>
       </w:pPr>
       <w:r>
-        <w:t>Browse upcoming FPSPA events.</w:t>
+        <w:t>Browse upcoming FHTA events.</w:t>
       </w:r>
     </w:p>
     <w:p>
@@ -1534,7 +1534,7 @@
     </w:p>
     <w:p>
       <w:r>
-        <w:t>The document system stores FPSPA forms, policies, templates, circulars, and other downloadable materials.</w:t>
+        <w:t>The document system stores FHTA forms, policies, templates, circulars, and other downloadable materials.</w:t>
       </w:r>
     </w:p>
     <w:p>
@@ -1933,7 +1933,7 @@
     </w:p>
     <w:p>
       <w:r>
-        <w:t>The representatives app helps members find FPSPA area and branch contacts.</w:t>
+        <w:t>The representatives app helps members find FHTA area and branch contacts.</w:t>
       </w:r>
     </w:p>
     <w:p>
@@ -2008,7 +2008,7 @@
     </w:p>
     <w:p>
       <w:r>
-        <w:t>The training app manages FPSPA courses, lessons, quizzes, workshops, attendance, and certificates.</w:t>
+        <w:t>The training app manages FHTA courses, lessons, quizzes, workshops, attendance, and certificates.</w:t>
       </w:r>
     </w:p>
     <w:p>
@@ -3488,7 +3488,7 @@
         <w:pStyle w:val="ListBullet"/>
       </w:pPr>
       <w:r>
-        <w:t>Upload only approved FPSPA documents and images.</w:t>
+        <w:t>Upload only approved FHTA documents and images.</w:t>
       </w:r>
     </w:p>
     <w:p>
@@ -3869,7 +3869,7 @@
     </w:p>
     <w:p>
       <w:r>
-        <w:t>For help using the FPSPA website:</w:t>
+        <w:t>For help using the FHTA website:</w:t>
       </w:r>
     </w:p>
     <w:p>
@@ -3885,7 +3885,7 @@
         <w:pStyle w:val="ListNumber"/>
       </w:pPr>
       <w:r>
-        <w:t>Contact FPSPA staff through the Contact page.</w:t>
+        <w:t>Contact FHTA staff through the Contact page.</w:t>
       </w:r>
     </w:p>
     <w:p>
@@ -3919,7 +3919,7 @@
       <w:rPr>
         <w:sz w:val="18"/>
       </w:rPr>
-      <w:t>FPSPA Website User Manual</w:t>
+      <w:t>FHTA Website User Manual</w:t>
     </w:r>
   </w:p>
 </w:ftr>
@@ -3937,7 +3937,7 @@
         <w:color w:val="505050"/>
         <w:sz w:val="18"/>
       </w:rPr>
-      <w:t>Fiji Primary School Principals Association ? Website User Manual</w:t>
+      <w:t>Fiji Head Teachers Association ? Website User Manual</w:t>
     </w:r>
   </w:p>
 </w:hdr>

</xml_diff>